<commit_message>
Course plan docx: new schedule (2026-10-01) with chapter 6 named 水産資源管理
Co-Authored-By: Claude Opus 5.5 <noreply@anthropic.com>
Claude-Session: https://claude.ai/code/session_01TeFnsvvc3WCpekJ2sj18Kh
</commit_message>
<xml_diff>
--- a/0概要/2026授業計画.docx
+++ b/0概要/2026授業計画.docx
@@ -1453,36 +1453,28 @@
             </w:pPr>
             <w:r>
               <w:rPr>
+                <w:rFonts w:ascii="ＭＳ Ｐ明朝" w:hAnsi="ＭＳ Ｐ明朝" w:cs="ＭＳ Ｐゴシック" w:hint="eastAsia"/>
+                <w:color w:val="000000"/>
+              </w:rPr>
+              <w:t>鯨類資源について（松田純佳）</w:t>
+            </w:r>
+          </w:p>
+        </w:tc>
+        <w:tc>
+          <w:tcPr>
+            <w:tcW w:w="1652" w:type="dxa"/>
+            <w:vAlign w:val="center"/>
+          </w:tcPr>
+          <w:p>
+            <w:pPr>
+              <w:rPr>
+                <w:rFonts w:ascii="ＭＳ Ｐ明朝" w:hAnsi="ＭＳ Ｐ明朝"/>
+                <w:color w:val="000000"/>
+              </w:rPr>
+            </w:pPr>
+            <w:r>
+              <w:rPr>
                 <w:rFonts w:ascii="ＭＳ Ｐ明朝" w:hAnsi="ＭＳ Ｐ明朝" w:hint="eastAsia"/>
-                <w:color w:val="000000"/>
-              </w:rPr>
-              <w:t xml:space="preserve">第6章　</w:t>
-            </w:r>
-            <w:r>
-              <w:rPr>
-                <w:rFonts w:ascii="ＭＳ Ｐ明朝" w:hAnsi="ＭＳ Ｐ明朝" w:cs="ＭＳ Ｐゴシック" w:hint="eastAsia"/>
-                <w:color w:val="000000"/>
-              </w:rPr>
-              <w:t>水産資源管理</w:t>
-            </w:r>
-          </w:p>
-        </w:tc>
-        <w:tc>
-          <w:tcPr>
-            <w:tcW w:w="1652" w:type="dxa"/>
-            <w:vAlign w:val="center"/>
-          </w:tcPr>
-          <w:p>
-            <w:pPr>
-              <w:rPr>
-                <w:rFonts w:ascii="ＭＳ Ｐ明朝" w:hAnsi="ＭＳ Ｐ明朝"/>
-                <w:color w:val="000000"/>
-              </w:rPr>
-            </w:pPr>
-            <w:r>
-              <w:rPr>
-                <w:rFonts w:ascii="ＭＳ Ｐ明朝" w:hAnsi="ＭＳ Ｐ明朝" w:hint="eastAsia"/>
-                <w:color w:val="000000"/>
               </w:rPr>
               <w:t>対面</w:t>
             </w:r>
@@ -1576,10 +1568,9 @@
             </w:pPr>
             <w:r>
               <w:rPr>
-                <w:rFonts w:ascii="ＭＳ Ｐ明朝" w:hAnsi="ＭＳ Ｐ明朝" w:hint="eastAsia"/>
-                <w:color w:val="000000"/>
-              </w:rPr>
-              <w:t>プレ試験</w:t>
+                <w:color w:val="000000"/>
+              </w:rPr>
+              <w:t>Reading Week</w:t>
             </w:r>
           </w:p>
         </w:tc>
@@ -1596,9 +1587,10 @@
             </w:pPr>
             <w:r>
               <w:rPr>
-                <w:rFonts w:ascii="ＭＳ Ｐ明朝" w:hAnsi="ＭＳ Ｐ明朝" w:hint="eastAsia"/>
-              </w:rPr>
-              <w:t>対面</w:t>
+                <w:rFonts w:ascii="ＭＳ Ｐ明朝" w:hAnsi="ＭＳ Ｐ明朝" w:cs="ＭＳ Ｐゴシック" w:hint="eastAsia"/>
+                <w:color w:val="000000"/>
+              </w:rPr>
+              <w:t>各自</w:t>
             </w:r>
           </w:p>
         </w:tc>
@@ -1691,9 +1683,17 @@
             </w:pPr>
             <w:r>
               <w:rPr>
-                <w:color w:val="000000"/>
-              </w:rPr>
-              <w:t>Reading Week</w:t>
+                <w:rFonts w:ascii="ＭＳ Ｐ明朝" w:hAnsi="ＭＳ Ｐ明朝" w:hint="eastAsia"/>
+                <w:color w:val="000000"/>
+              </w:rPr>
+              <w:t xml:space="preserve">第6章　</w:t>
+            </w:r>
+            <w:r>
+              <w:rPr>
+                <w:rFonts w:ascii="ＭＳ Ｐ明朝" w:hAnsi="ＭＳ Ｐ明朝" w:cs="ＭＳ Ｐゴシック" w:hint="eastAsia"/>
+                <w:color w:val="000000"/>
+              </w:rPr>
+              <w:t>水産資源管理</w:t>
             </w:r>
           </w:p>
         </w:tc>
@@ -1711,10 +1711,9 @@
             </w:pPr>
             <w:r>
               <w:rPr>
-                <w:rFonts w:ascii="ＭＳ Ｐ明朝" w:hAnsi="ＭＳ Ｐ明朝" w:cs="ＭＳ Ｐゴシック" w:hint="eastAsia"/>
-                <w:color w:val="000000"/>
-              </w:rPr>
-              <w:t>各自</w:t>
+                <w:rFonts w:ascii="ＭＳ Ｐ明朝" w:hAnsi="ＭＳ Ｐ明朝" w:hint="eastAsia"/>
+              </w:rPr>
+              <w:t>対面</w:t>
             </w:r>
           </w:p>
         </w:tc>
@@ -1799,10 +1798,10 @@
             </w:pPr>
             <w:r>
               <w:rPr>
-                <w:rFonts w:ascii="ＭＳ Ｐ明朝" w:hAnsi="ＭＳ Ｐ明朝" w:cs="ＭＳ Ｐゴシック" w:hint="eastAsia"/>
-                <w:color w:val="000000"/>
-              </w:rPr>
-              <w:t>本試験</w:t>
+                <w:rFonts w:ascii="ＭＳ Ｐ明朝" w:hAnsi="ＭＳ Ｐ明朝" w:hint="eastAsia"/>
+                <w:color w:val="000000"/>
+              </w:rPr>
+              <w:t>プレ試験</w:t>
             </w:r>
           </w:p>
         </w:tc>
@@ -1821,7 +1820,6 @@
             <w:r>
               <w:rPr>
                 <w:rFonts w:ascii="ＭＳ Ｐ明朝" w:hAnsi="ＭＳ Ｐ明朝" w:hint="eastAsia"/>
-                <w:color w:val="000000"/>
               </w:rPr>
               <w:t>対面</w:t>
             </w:r>
@@ -1915,31 +1913,30 @@
             </w:pPr>
             <w:r>
               <w:rPr>
+                <w:color w:val="000000"/>
+              </w:rPr>
+              <w:t>Reading Week</w:t>
+            </w:r>
+          </w:p>
+        </w:tc>
+        <w:tc>
+          <w:tcPr>
+            <w:tcW w:w="1652" w:type="dxa"/>
+            <w:vAlign w:val="center"/>
+          </w:tcPr>
+          <w:p>
+            <w:pPr>
+              <w:rPr>
+                <w:rFonts w:ascii="ＭＳ Ｐ明朝" w:hAnsi="ＭＳ Ｐ明朝" w:cs="ＭＳ Ｐゴシック"/>
+                <w:color w:val="000000"/>
+              </w:rPr>
+            </w:pPr>
+            <w:r>
+              <w:rPr>
                 <w:rFonts w:ascii="ＭＳ Ｐ明朝" w:hAnsi="ＭＳ Ｐ明朝" w:cs="ＭＳ Ｐゴシック" w:hint="eastAsia"/>
                 <w:color w:val="000000"/>
               </w:rPr>
-              <w:t>鯨類資源について（松田純佳）</w:t>
-            </w:r>
-          </w:p>
-        </w:tc>
-        <w:tc>
-          <w:tcPr>
-            <w:tcW w:w="1652" w:type="dxa"/>
-            <w:vAlign w:val="center"/>
-          </w:tcPr>
-          <w:p>
-            <w:pPr>
-              <w:rPr>
-                <w:rFonts w:ascii="ＭＳ Ｐ明朝" w:hAnsi="ＭＳ Ｐ明朝" w:cs="ＭＳ Ｐゴシック"/>
-                <w:color w:val="000000"/>
-              </w:rPr>
-            </w:pPr>
-            <w:r>
-              <w:rPr>
-                <w:rFonts w:ascii="ＭＳ Ｐ明朝" w:hAnsi="ＭＳ Ｐ明朝" w:hint="eastAsia"/>
-                <w:color w:val="000000"/>
-              </w:rPr>
-              <w:t>対面</w:t>
+              <w:t>各自</w:t>
             </w:r>
           </w:p>
         </w:tc>
@@ -2031,9 +2028,10 @@
             </w:pPr>
             <w:r>
               <w:rPr>
-                <w:color w:val="000000"/>
-              </w:rPr>
-              <w:t>Reading Week</w:t>
+                <w:rFonts w:ascii="ＭＳ Ｐ明朝" w:hAnsi="ＭＳ Ｐ明朝" w:cs="ＭＳ Ｐゴシック" w:hint="eastAsia"/>
+                <w:color w:val="000000"/>
+              </w:rPr>
+              <w:t>本試験</w:t>
             </w:r>
           </w:p>
         </w:tc>
@@ -2051,10 +2049,10 @@
             </w:pPr>
             <w:r>
               <w:rPr>
-                <w:rFonts w:ascii="ＭＳ Ｐ明朝" w:hAnsi="ＭＳ Ｐ明朝" w:cs="ＭＳ Ｐゴシック" w:hint="eastAsia"/>
-                <w:color w:val="000000"/>
-              </w:rPr>
-              <w:t>各自</w:t>
+                <w:rFonts w:ascii="ＭＳ Ｐ明朝" w:hAnsi="ＭＳ Ｐ明朝" w:hint="eastAsia"/>
+                <w:color w:val="000000"/>
+              </w:rPr>
+              <w:t>対面</w:t>
             </w:r>
           </w:p>
         </w:tc>
@@ -2092,7 +2090,7 @@
             <v:path o:extrusionok="f" gradientshapeok="t" o:connecttype="rect"/>
             <o:lock v:ext="edit" aspectratio="t"/>
           </v:shapetype>
-          <v:shape id="_x0000_s2051" type="#_x0000_t75" style="position:absolute;left:0;text-align:left;margin-left:365.05pt;margin-top:15.75pt;width:92.55pt;height:92.55pt;z-index:251659264;mso-position-horizontal-relative:text;mso-position-vertical-relative:text;mso-width-relative:page;mso-height-relative:page">
+          <v:shape id="_x0000_s2051" type="#_x0000_t75" style="position:absolute;left:0;text-align:left;margin-left:365.15pt;margin-top:12.2pt;width:92.55pt;height:92.55pt;z-index:-1;mso-position-horizontal:absolute;mso-position-horizontal-relative:text;mso-position-vertical:absolute;mso-position-vertical-relative:text;mso-width-relative:page;mso-height-relative:page">
             <v:imagedata r:id="rId6" o:title=""/>
           </v:shape>
         </w:pict>
@@ -2404,6 +2402,9 @@
     <w:p>
       <w:pPr>
         <w:ind w:leftChars="355" w:left="852"/>
+        <w:rPr>
+          <w:rFonts w:hint="eastAsia"/>
+        </w:rPr>
       </w:pPr>
       <w:r>
         <w:rPr>
@@ -2455,6 +2456,31 @@
           <w:t>https://a.r10.to/hRe8le</w:t>
         </w:r>
       </w:hyperlink>
+      <w:r>
+        <w:tab/>
+      </w:r>
+      <w:r>
+        <w:rPr>
+          <w:rFonts w:hint="eastAsia"/>
+        </w:rPr>
+        <w:t xml:space="preserve">  </w:t>
+      </w:r>
+      <w:r>
+        <w:rPr>
+          <w:rFonts w:hint="eastAsia"/>
+          <w:sz w:val="14"/>
+          <w:szCs w:val="14"/>
+        </w:rPr>
+        <w:t>教科書</w:t>
+      </w:r>
+      <w:r>
+        <w:rPr>
+          <w:rFonts w:hint="eastAsia"/>
+          <w:sz w:val="14"/>
+          <w:szCs w:val="14"/>
+        </w:rPr>
+        <w:t>URL</w:t>
+      </w:r>
     </w:p>
     <w:p>
       <w:pPr>

</xml_diff>